<commit_message>
Swap IMGs to Cyclops Cove Sprout photos; correct CCBD2 image flag
Co-Authored-By: Claude Opus 5.5 <noreply@anthropic.com>
</commit_message>
<xml_diff>
--- a/Build_Summaries/Cyclops_Cove_Sprout_Bundle_Build_Summary.docx
+++ b/Build_Summaries/Cyclops_Cove_Sprout_Bundle_Build_Summary.docx
@@ -1736,7 +1736,7 @@
           <w:b w:val="0"/>
           <w:sz w:val="20"/>
         </w:rPr>
-        <w:t>All 9 Cyclops_Cove-Sprouts* files uploaded (the featured image plus the 8 files sharing its prefix). No filename collisions, so no _v2 suffixes. Cyclops_Cove-Sprouts1001 is the featured image (position 1) and is linked to all three variants. The Cyclops_Cove1001–1009 files are the Kandi Bundle's photos and are already on CCBD1, so they were not uploaded here (see Flags).</w:t>
+        <w:t>All 9 Cyclops_Cove-Sprouts* files uploaded (the featured image plus the 8 files sharing its prefix). No filename collisions, so no _v2 suffixes. Cyclops_Cove-Sprouts1001 is the featured image (position 1) and is linked to all three variants. IMGs/ held only these 9 files.</w:t>
       </w:r>
     </w:p>
     <w:tbl>
@@ -3848,25 +3848,6 @@
           <w:sz w:val="20"/>
         </w:rPr>
         <w:t>The saxophone monster sits directly on the alligator clip with no visible spring, while the template says each sprout combines a charm with a metal spring and alligator clip. Confirm whether this design ships with a spring.</w:t>
-      </w:r>
-    </w:p>
-    <w:p>
-      <w:pPr>
-        <w:pStyle w:val="ListParagraph"/>
-      </w:pPr>
-      <w:r>
-        <w:rPr>
-          <w:b/>
-          <w:sz w:val="20"/>
-        </w:rPr>
-        <w:t xml:space="preserve">Image prefix. </w:t>
-      </w:r>
-      <w:r>
-        <w:rPr>
-          <w:b w:val="0"/>
-          <w:sz w:val="20"/>
-        </w:rPr>
-        <w:t>Read literally, the prefix rule (text before the last "_") gives "Cyclops", which would also match the Kandi Bundle's Cyclops_Cove1001–1009. Those are kandi charms already on CCBD1, so only the Cyclops_Cove-Sprouts* files were uploaded here.</w:t>
       </w:r>
     </w:p>
     <w:p>

</xml_diff>